<commit_message>
Sprint 3 - 10.04.26
</commit_message>
<xml_diff>
--- a/Documentação/Documentação.docx
+++ b/Documentação/Documentação.docx
@@ -511,7 +511,7 @@
             </w:rPr>
             <w:fldChar w:fldCharType="separate"/>
           </w:r>
-          <w:hyperlink w:anchor="_Toc226731592" w:history="1">
+          <w:hyperlink w:anchor="_Toc226731972" w:history="1">
             <w:r>
               <w:rPr>
                 <w:rStyle w:val="Hyperlink"/>
@@ -559,7 +559,7 @@
                 <w:noProof/>
                 <w:webHidden/>
               </w:rPr>
-              <w:instrText xml:space="preserve"> PAGEREF _Toc226731592 \h </w:instrText>
+              <w:instrText xml:space="preserve"> PAGEREF _Toc226731972 \h </w:instrText>
             </w:r>
             <w:r>
               <w:rPr>
@@ -599,7 +599,7 @@
               <w:lang w:eastAsia="pt-BR"/>
             </w:rPr>
           </w:pPr>
-          <w:hyperlink w:anchor="_Toc226731593" w:history="1">
+          <w:hyperlink w:anchor="_Toc226731973" w:history="1">
             <w:r>
               <w:rPr>
                 <w:rStyle w:val="Hyperlink"/>
@@ -647,7 +647,7 @@
                 <w:noProof/>
                 <w:webHidden/>
               </w:rPr>
-              <w:instrText xml:space="preserve"> PAGEREF _Toc226731593 \h </w:instrText>
+              <w:instrText xml:space="preserve"> PAGEREF _Toc226731973 \h </w:instrText>
             </w:r>
             <w:r>
               <w:rPr>
@@ -691,7 +691,7 @@
               <w:lang w:eastAsia="pt-BR"/>
             </w:rPr>
           </w:pPr>
-          <w:hyperlink w:anchor="_Toc226731594" w:history="1">
+          <w:hyperlink w:anchor="_Toc226731974" w:history="1">
             <w:r>
               <w:rPr>
                 <w:rStyle w:val="Hyperlink"/>
@@ -739,7 +739,7 @@
                 <w:noProof/>
                 <w:webHidden/>
               </w:rPr>
-              <w:instrText xml:space="preserve"> PAGEREF _Toc226731594 \h </w:instrText>
+              <w:instrText xml:space="preserve"> PAGEREF _Toc226731974 \h </w:instrText>
             </w:r>
             <w:r>
               <w:rPr>
@@ -783,7 +783,7 @@
               <w:lang w:eastAsia="pt-BR"/>
             </w:rPr>
           </w:pPr>
-          <w:hyperlink w:anchor="_Toc226731595" w:history="1">
+          <w:hyperlink w:anchor="_Toc226731975" w:history="1">
             <w:r>
               <w:rPr>
                 <w:rStyle w:val="Hyperlink"/>
@@ -831,7 +831,7 @@
                 <w:noProof/>
                 <w:webHidden/>
               </w:rPr>
-              <w:instrText xml:space="preserve"> PAGEREF _Toc226731595 \h </w:instrText>
+              <w:instrText xml:space="preserve"> PAGEREF _Toc226731975 \h </w:instrText>
             </w:r>
             <w:r>
               <w:rPr>
@@ -871,7 +871,7 @@
               <w:lang w:eastAsia="pt-BR"/>
             </w:rPr>
           </w:pPr>
-          <w:hyperlink w:anchor="_Toc226731596" w:history="1">
+          <w:hyperlink w:anchor="_Toc226731976" w:history="1">
             <w:r>
               <w:rPr>
                 <w:rStyle w:val="Hyperlink"/>
@@ -919,7 +919,7 @@
                 <w:noProof/>
                 <w:webHidden/>
               </w:rPr>
-              <w:instrText xml:space="preserve"> PAGEREF _Toc226731596 \h </w:instrText>
+              <w:instrText xml:space="preserve"> PAGEREF _Toc226731976 \h </w:instrText>
             </w:r>
             <w:r>
               <w:rPr>
@@ -963,7 +963,7 @@
               <w:lang w:eastAsia="pt-BR"/>
             </w:rPr>
           </w:pPr>
-          <w:hyperlink w:anchor="_Toc226731597" w:history="1">
+          <w:hyperlink w:anchor="_Toc226731977" w:history="1">
             <w:r>
               <w:rPr>
                 <w:rStyle w:val="Hyperlink"/>
@@ -1011,7 +1011,7 @@
                 <w:noProof/>
                 <w:webHidden/>
               </w:rPr>
-              <w:instrText xml:space="preserve"> PAGEREF _Toc226731597 \h </w:instrText>
+              <w:instrText xml:space="preserve"> PAGEREF _Toc226731977 \h </w:instrText>
             </w:r>
             <w:r>
               <w:rPr>
@@ -1055,7 +1055,7 @@
               <w:lang w:eastAsia="pt-BR"/>
             </w:rPr>
           </w:pPr>
-          <w:hyperlink w:anchor="_Toc226731598" w:history="1">
+          <w:hyperlink w:anchor="_Toc226731978" w:history="1">
             <w:r>
               <w:rPr>
                 <w:rStyle w:val="Hyperlink"/>
@@ -1103,7 +1103,7 @@
                 <w:noProof/>
                 <w:webHidden/>
               </w:rPr>
-              <w:instrText xml:space="preserve"> PAGEREF _Toc226731598 \h </w:instrText>
+              <w:instrText xml:space="preserve"> PAGEREF _Toc226731978 \h </w:instrText>
             </w:r>
             <w:r>
               <w:rPr>
@@ -1147,7 +1147,7 @@
               <w:lang w:eastAsia="pt-BR"/>
             </w:rPr>
           </w:pPr>
-          <w:hyperlink w:anchor="_Toc226731599" w:history="1">
+          <w:hyperlink w:anchor="_Toc226731979" w:history="1">
             <w:r>
               <w:rPr>
                 <w:rStyle w:val="Hyperlink"/>
@@ -1195,7 +1195,7 @@
                 <w:noProof/>
                 <w:webHidden/>
               </w:rPr>
-              <w:instrText xml:space="preserve"> PAGEREF _Toc226731599 \h </w:instrText>
+              <w:instrText xml:space="preserve"> PAGEREF _Toc226731979 \h </w:instrText>
             </w:r>
             <w:r>
               <w:rPr>
@@ -1235,7 +1235,7 @@
               <w:lang w:eastAsia="pt-BR"/>
             </w:rPr>
           </w:pPr>
-          <w:hyperlink w:anchor="_Toc226731600" w:history="1">
+          <w:hyperlink w:anchor="_Toc226731980" w:history="1">
             <w:r>
               <w:rPr>
                 <w:rStyle w:val="Hyperlink"/>
@@ -1283,7 +1283,7 @@
                 <w:noProof/>
                 <w:webHidden/>
               </w:rPr>
-              <w:instrText xml:space="preserve"> PAGEREF _Toc226731600 \h </w:instrText>
+              <w:instrText xml:space="preserve"> PAGEREF _Toc226731980 \h </w:instrText>
             </w:r>
             <w:r>
               <w:rPr>
@@ -1323,7 +1323,7 @@
               <w:lang w:eastAsia="pt-BR"/>
             </w:rPr>
           </w:pPr>
-          <w:hyperlink w:anchor="_Toc226731601" w:history="1">
+          <w:hyperlink w:anchor="_Toc226731981" w:history="1">
             <w:r>
               <w:rPr>
                 <w:rStyle w:val="Hyperlink"/>
@@ -1371,7 +1371,7 @@
                 <w:noProof/>
                 <w:webHidden/>
               </w:rPr>
-              <w:instrText xml:space="preserve"> PAGEREF _Toc226731601 \h </w:instrText>
+              <w:instrText xml:space="preserve"> PAGEREF _Toc226731981 \h </w:instrText>
             </w:r>
             <w:r>
               <w:rPr>
@@ -1411,7 +1411,7 @@
               <w:lang w:eastAsia="pt-BR"/>
             </w:rPr>
           </w:pPr>
-          <w:hyperlink w:anchor="_Toc226731602" w:history="1">
+          <w:hyperlink w:anchor="_Toc226731982" w:history="1">
             <w:r>
               <w:rPr>
                 <w:rStyle w:val="Hyperlink"/>
@@ -1459,7 +1459,7 @@
                 <w:noProof/>
                 <w:webHidden/>
               </w:rPr>
-              <w:instrText xml:space="preserve"> PAGEREF _Toc226731602 \h </w:instrText>
+              <w:instrText xml:space="preserve"> PAGEREF _Toc226731982 \h </w:instrText>
             </w:r>
             <w:r>
               <w:rPr>
@@ -1503,7 +1503,7 @@
               <w:lang w:eastAsia="pt-BR"/>
             </w:rPr>
           </w:pPr>
-          <w:hyperlink w:anchor="_Toc226731603" w:history="1">
+          <w:hyperlink w:anchor="_Toc226731983" w:history="1">
             <w:r>
               <w:rPr>
                 <w:rStyle w:val="Hyperlink"/>
@@ -1551,7 +1551,7 @@
                 <w:noProof/>
                 <w:webHidden/>
               </w:rPr>
-              <w:instrText xml:space="preserve"> PAGEREF _Toc226731603 \h </w:instrText>
+              <w:instrText xml:space="preserve"> PAGEREF _Toc226731983 \h </w:instrText>
             </w:r>
             <w:r>
               <w:rPr>
@@ -1595,7 +1595,7 @@
               <w:lang w:eastAsia="pt-BR"/>
             </w:rPr>
           </w:pPr>
-          <w:hyperlink w:anchor="_Toc226731604" w:history="1">
+          <w:hyperlink w:anchor="_Toc226731984" w:history="1">
             <w:r>
               <w:rPr>
                 <w:rStyle w:val="Hyperlink"/>
@@ -1643,7 +1643,7 @@
                 <w:noProof/>
                 <w:webHidden/>
               </w:rPr>
-              <w:instrText xml:space="preserve"> PAGEREF _Toc226731604 \h </w:instrText>
+              <w:instrText xml:space="preserve"> PAGEREF _Toc226731984 \h </w:instrText>
             </w:r>
             <w:r>
               <w:rPr>
@@ -1687,7 +1687,7 @@
               <w:lang w:eastAsia="pt-BR"/>
             </w:rPr>
           </w:pPr>
-          <w:hyperlink w:anchor="_Toc226731605" w:history="1">
+          <w:hyperlink w:anchor="_Toc226731985" w:history="1">
             <w:r>
               <w:rPr>
                 <w:rStyle w:val="Hyperlink"/>
@@ -1735,7 +1735,7 @@
                 <w:noProof/>
                 <w:webHidden/>
               </w:rPr>
-              <w:instrText xml:space="preserve"> PAGEREF _Toc226731605 \h </w:instrText>
+              <w:instrText xml:space="preserve"> PAGEREF _Toc226731985 \h </w:instrText>
             </w:r>
             <w:r>
               <w:rPr>
@@ -1978,7 +1978,7 @@
           <w:szCs w:val="32"/>
         </w:rPr>
       </w:pPr>
-      <w:bookmarkStart w:id="0" w:name="_Toc226731592"/>
+      <w:bookmarkStart w:id="0" w:name="_Toc226731972"/>
       <w:r>
         <w:rPr>
           <w:rFonts w:ascii="Times New Roman" w:eastAsia="Times New Roman" w:hAnsi="Times New Roman" w:cs="Times New Roman"/>
@@ -2116,7 +2116,7 @@
           <w:szCs w:val="32"/>
         </w:rPr>
       </w:pPr>
-      <w:bookmarkStart w:id="1" w:name="_Toc226731593"/>
+      <w:bookmarkStart w:id="1" w:name="_Toc226731973"/>
       <w:r>
         <w:rPr>
           <w:rFonts w:ascii="Times New Roman" w:eastAsia="Times New Roman" w:hAnsi="Times New Roman" w:cs="Times New Roman"/>
@@ -2165,7 +2165,7 @@
           <w:szCs w:val="28"/>
         </w:rPr>
       </w:pPr>
-      <w:bookmarkStart w:id="2" w:name="_Toc226731594"/>
+      <w:bookmarkStart w:id="2" w:name="_Toc226731974"/>
       <w:r>
         <w:rPr>
           <w:rFonts w:ascii="Times New Roman" w:eastAsia="Times New Roman" w:hAnsi="Times New Roman" w:cs="Times New Roman"/>
@@ -2880,7 +2880,7 @@
           <w:szCs w:val="28"/>
         </w:rPr>
       </w:pPr>
-      <w:bookmarkStart w:id="3" w:name="_Toc226731595"/>
+      <w:bookmarkStart w:id="3" w:name="_Toc226731975"/>
       <w:r>
         <w:rPr>
           <w:rFonts w:ascii="Times New Roman" w:eastAsia="Times New Roman" w:hAnsi="Times New Roman" w:cs="Times New Roman"/>
@@ -3632,7 +3632,7 @@
           <w:szCs w:val="32"/>
         </w:rPr>
       </w:pPr>
-      <w:bookmarkStart w:id="4" w:name="_Toc226731596"/>
+      <w:bookmarkStart w:id="4" w:name="_Toc226731976"/>
       <w:r>
         <w:rPr>
           <w:rFonts w:ascii="Times New Roman" w:eastAsia="Times New Roman" w:hAnsi="Times New Roman" w:cs="Times New Roman"/>
@@ -3880,7 +3880,7 @@
           <w:szCs w:val="28"/>
         </w:rPr>
       </w:pPr>
-      <w:bookmarkStart w:id="5" w:name="_Toc226731597"/>
+      <w:bookmarkStart w:id="5" w:name="_Toc226731977"/>
       <w:proofErr w:type="spellStart"/>
       <w:r>
         <w:rPr>
@@ -3982,7 +3982,7 @@
           <w:szCs w:val="28"/>
         </w:rPr>
       </w:pPr>
-      <w:bookmarkStart w:id="6" w:name="_Toc226731598"/>
+      <w:bookmarkStart w:id="6" w:name="_Toc226731978"/>
       <w:proofErr w:type="spellStart"/>
       <w:r>
         <w:rPr>
@@ -4076,7 +4076,7 @@
           <w:szCs w:val="28"/>
         </w:rPr>
       </w:pPr>
-      <w:bookmarkStart w:id="7" w:name="_Toc226731599"/>
+      <w:bookmarkStart w:id="7" w:name="_Toc226731979"/>
       <w:proofErr w:type="spellStart"/>
       <w:r>
         <w:rPr>
@@ -4186,7 +4186,7 @@
           <w:szCs w:val="32"/>
         </w:rPr>
       </w:pPr>
-      <w:bookmarkStart w:id="8" w:name="_Toc226731600"/>
+      <w:bookmarkStart w:id="8" w:name="_Toc226731980"/>
       <w:r>
         <w:rPr>
           <w:rFonts w:ascii="Times New Roman" w:eastAsia="Times New Roman" w:hAnsi="Times New Roman" w:cs="Times New Roman"/>
@@ -4319,7 +4319,7 @@
           <w:szCs w:val="32"/>
         </w:rPr>
       </w:pPr>
-      <w:bookmarkStart w:id="9" w:name="_Toc226731601"/>
+      <w:bookmarkStart w:id="9" w:name="_Toc226731981"/>
       <w:r>
         <w:rPr>
           <w:rFonts w:ascii="Times New Roman" w:eastAsia="Times New Roman" w:hAnsi="Times New Roman" w:cs="Times New Roman"/>
@@ -4364,13 +4364,6 @@
         </w:rPr>
         <w:t>, que são representações visuais estruturais da interface do usuário. Essa prática serve para planejar e validar o layout, a navegação e as funcionalidades do sistema antes de iniciar o desenvolvimento técnico. Com base na imagem, nota-se o mapeamento claro do fluxo de navegação da aplicação, apresentando na linha superior as telas de listagem e pesquisa de dados (como chamados, colaboradores e setores) e, na linha inferior, as respectivas telas de formulários para a inserção de novos registros. Isso permite que a equipe e os clientes alinhem as expectativas sobre a usabilidade e a disposição das informações de forma rápida e visual.</w:t>
       </w:r>
-    </w:p>
-    <w:p>
-      <w:pPr>
-        <w:rPr>
-          <w:rFonts w:ascii="Times New Roman" w:hAnsi="Times New Roman" w:cs="Times New Roman"/>
-        </w:rPr>
-      </w:pPr>
     </w:p>
     <w:p>
       <w:pPr>
@@ -4467,6 +4460,30 @@
           </wp:inline>
         </w:drawing>
       </w:r>
+    </w:p>
+    <w:p>
+      <w:pPr>
+        <w:rPr>
+          <w:rFonts w:ascii="Times New Roman" w:hAnsi="Times New Roman" w:cs="Times New Roman"/>
+        </w:rPr>
+      </w:pPr>
+      <w:r>
+        <w:rPr>
+          <w:rFonts w:ascii="Times New Roman" w:hAnsi="Times New Roman" w:cs="Times New Roman"/>
+        </w:rPr>
+        <w:t xml:space="preserve">Link: </w:t>
+      </w:r>
+      <w:hyperlink r:id="rId13" w:history="1">
+        <w:proofErr w:type="spellStart"/>
+        <w:r>
+          <w:rPr>
+            <w:rStyle w:val="Hyperlink"/>
+            <w:rFonts w:ascii="Times New Roman" w:hAnsi="Times New Roman" w:cs="Times New Roman"/>
+          </w:rPr>
+          <w:t>Figma</w:t>
+        </w:r>
+        <w:proofErr w:type="spellEnd"/>
+      </w:hyperlink>
       <w:r>
         <w:rPr>
           <w:rFonts w:ascii="Times New Roman" w:hAnsi="Times New Roman" w:cs="Times New Roman"/>
@@ -4490,7 +4507,7 @@
           <w:szCs w:val="32"/>
         </w:rPr>
       </w:pPr>
-      <w:bookmarkStart w:id="10" w:name="_Toc226731602"/>
+      <w:bookmarkStart w:id="10" w:name="_Toc226731982"/>
       <w:r>
         <w:rPr>
           <w:rFonts w:ascii="Times New Roman" w:eastAsia="Times New Roman" w:hAnsi="Times New Roman" w:cs="Times New Roman"/>
@@ -4537,7 +4554,7 @@
           <w:szCs w:val="28"/>
         </w:rPr>
       </w:pPr>
-      <w:bookmarkStart w:id="11" w:name="_Toc226731603"/>
+      <w:bookmarkStart w:id="11" w:name="_Toc226731983"/>
       <w:r>
         <w:rPr>
           <w:rFonts w:ascii="Times New Roman" w:eastAsia="Times New Roman" w:hAnsi="Times New Roman" w:cs="Times New Roman"/>
@@ -4850,7 +4867,7 @@
                     <pic:cNvPicPr/>
                   </pic:nvPicPr>
                   <pic:blipFill>
-                    <a:blip r:embed="rId13" cstate="print">
+                    <a:blip r:embed="rId14" cstate="print">
                       <a:extLst>
                         <a:ext uri="{28A0092B-C50C-407E-A947-70E740481C1C}">
                           <a14:useLocalDpi xmlns:a14="http://schemas.microsoft.com/office/drawing/2010/main" val="0"/>
@@ -4893,7 +4910,7 @@
           <w:szCs w:val="28"/>
         </w:rPr>
       </w:pPr>
-      <w:bookmarkStart w:id="12" w:name="_Toc226731604"/>
+      <w:bookmarkStart w:id="12" w:name="_Toc226731984"/>
       <w:r>
         <w:rPr>
           <w:rFonts w:ascii="Times New Roman" w:eastAsia="Times New Roman" w:hAnsi="Times New Roman" w:cs="Times New Roman"/>
@@ -4983,7 +5000,7 @@
                     <pic:cNvPicPr/>
                   </pic:nvPicPr>
                   <pic:blipFill>
-                    <a:blip r:embed="rId14">
+                    <a:blip r:embed="rId15">
                       <a:extLst>
                         <a:ext uri="{28A0092B-C50C-407E-A947-70E740481C1C}">
                           <a14:useLocalDpi xmlns:a14="http://schemas.microsoft.com/office/drawing/2010/main" val="0"/>
@@ -5029,7 +5046,7 @@
       <w:r>
         <w:br w:type="page"/>
       </w:r>
-      <w:bookmarkStart w:id="13" w:name="_Toc226731605"/>
+      <w:bookmarkStart w:id="13" w:name="_Toc226731985"/>
       <w:r>
         <w:rPr>
           <w:rFonts w:ascii="Times New Roman" w:eastAsia="Times New Roman" w:hAnsi="Times New Roman" w:cs="Times New Roman"/>
@@ -5120,7 +5137,7 @@
                     <pic:cNvPicPr/>
                   </pic:nvPicPr>
                   <pic:blipFill>
-                    <a:blip r:embed="rId15" cstate="print">
+                    <a:blip r:embed="rId16" cstate="print">
                       <a:extLst>
                         <a:ext uri="{28A0092B-C50C-407E-A947-70E740481C1C}">
                           <a14:useLocalDpi xmlns:a14="http://schemas.microsoft.com/office/drawing/2010/main" val="0"/>
@@ -5148,7 +5165,7 @@
       </w:r>
     </w:p>
     <w:sectPr>
-      <w:footerReference w:type="default" r:id="rId16"/>
+      <w:footerReference w:type="default" r:id="rId17"/>
       <w:pgSz w:w="11906" w:h="16838"/>
       <w:pgMar w:top="1417" w:right="1701" w:bottom="1417" w:left="1701" w:header="708" w:footer="708" w:gutter="0"/>
       <w:pgNumType w:start="1"/>

</xml_diff>